<commit_message>
Knock knock  Who's there?   Europe  Europe who?   No, you're a poo
</commit_message>
<xml_diff>
--- a/arepitas-de-padres/todo list.docx
+++ b/arepitas-de-padres/todo list.docx
@@ -535,7 +535,31 @@
       </w:pPr>
       <w:r>
         <w:rPr/>
-        <w:t>glowing borders on hover</w:t>
+        <w:t xml:space="preserve">glowing borders </w:t>
+      </w:r>
+      <w:r>
+        <w:rPr/>
+        <w:t xml:space="preserve">for pending interactions </w:t>
+      </w:r>
+      <w:r>
+        <w:rPr/>
+        <w:t>on hover</w:t>
+      </w:r>
+    </w:p>
+    <w:p>
+      <w:pPr>
+        <w:pStyle w:val="Normal"/>
+        <w:numPr>
+          <w:ilvl w:val="0"/>
+          <w:numId w:val="1"/>
+        </w:numPr>
+        <w:bidi w:val="0"/>
+        <w:jc w:val="start"/>
+        <w:rPr/>
+      </w:pPr>
+      <w:r>
+        <w:rPr/>
+        <w:t>disposable pans!!!</w:t>
       </w:r>
     </w:p>
     <w:p>

</xml_diff>